<commit_message>
fix: docx résiliation adresse
</commit_message>
<xml_diff>
--- a/src/assets/docx/resiliation.docx
+++ b/src/assets/docx/resiliation.docx
@@ -110,6 +110,19 @@
       </w:pPr>
       <w:r>
         <w:rPr/>
+        <w:t>38121 Chonas l’Amballan</w:t>
+      </w:r>
+    </w:p>
+    <w:p>
+      <w:pPr>
+        <w:pStyle w:val="Normal"/>
+        <w:spacing w:lineRule="auto" w:line="240" w:before="0" w:after="0"/>
+        <w:ind w:left="6096" w:hanging="0"/>
+        <w:jc w:val="both"/>
+        <w:rPr/>
+      </w:pPr>
+      <w:r>
+        <w:rPr/>
       </w:r>
     </w:p>
     <w:p>
@@ -207,11 +220,7 @@
       </w:pPr>
       <w:r>
         <w:rPr/>
-        <w:t xml:space="preserve">En vertu d’un contrat de location meublée signé le </w:t>
-      </w:r>
-      <w:r>
-        <w:rPr/>
-        <w:t>{</w:t>
+        <w:t>En vertu d’un contrat de location meublée signé le {</w:t>
       </w:r>
       <w:r>
         <w:rPr>
@@ -225,11 +234,7 @@
       </w:r>
       <w:r>
         <w:rPr/>
-        <w:t>}</w:t>
-      </w:r>
-      <w:r>
-        <w:rPr/>
-        <w:t xml:space="preserve">, je suis locataire d’un logement meublé situé à l’adresse indiquée ci-dessus. Le délai de préavis, conformément à l’article 25-8 de la loi n°89-462 du 6 juillet 1989, est d’au moins un mois et court à compter du jour de la réception de la présente lettre. </w:t>
+        <w:t xml:space="preserve">}, je suis locataire d’un logement meublé situé à l’adresse indiquée ci-dessus. Le délai de préavis, conformément à l’article 25-8 de la loi n°89-462 du 6 juillet 1989, est d’au moins un mois et court à compter du jour de la réception de la présente lettre. </w:t>
       </w:r>
     </w:p>
     <w:p>

</xml_diff>

<commit_message>
Fix/docx resiliation adresse (#54)
* fix: mail body

* fix: docx résiliation adresse

---------

Co-authored-by: Christian COLEY <christian.coley@smile.com>
</commit_message>
<xml_diff>
--- a/src/assets/docx/resiliation.docx
+++ b/src/assets/docx/resiliation.docx
@@ -110,6 +110,19 @@
       </w:pPr>
       <w:r>
         <w:rPr/>
+        <w:t>38121 Chonas l’Amballan</w:t>
+      </w:r>
+    </w:p>
+    <w:p>
+      <w:pPr>
+        <w:pStyle w:val="Normal"/>
+        <w:spacing w:lineRule="auto" w:line="240" w:before="0" w:after="0"/>
+        <w:ind w:left="6096" w:hanging="0"/>
+        <w:jc w:val="both"/>
+        <w:rPr/>
+      </w:pPr>
+      <w:r>
+        <w:rPr/>
       </w:r>
     </w:p>
     <w:p>
@@ -207,11 +220,7 @@
       </w:pPr>
       <w:r>
         <w:rPr/>
-        <w:t xml:space="preserve">En vertu d’un contrat de location meublée signé le </w:t>
-      </w:r>
-      <w:r>
-        <w:rPr/>
-        <w:t>{</w:t>
+        <w:t>En vertu d’un contrat de location meublée signé le {</w:t>
       </w:r>
       <w:r>
         <w:rPr>
@@ -225,11 +234,7 @@
       </w:r>
       <w:r>
         <w:rPr/>
-        <w:t>}</w:t>
-      </w:r>
-      <w:r>
-        <w:rPr/>
-        <w:t xml:space="preserve">, je suis locataire d’un logement meublé situé à l’adresse indiquée ci-dessus. Le délai de préavis, conformément à l’article 25-8 de la loi n°89-462 du 6 juillet 1989, est d’au moins un mois et court à compter du jour de la réception de la présente lettre. </w:t>
+        <w:t xml:space="preserve">}, je suis locataire d’un logement meublé situé à l’adresse indiquée ci-dessus. Le délai de préavis, conformément à l’article 25-8 de la loi n°89-462 du 6 juillet 1989, est d’au moins un mois et court à compter du jour de la réception de la présente lettre. </w:t>
       </w:r>
     </w:p>
     <w:p>

</xml_diff>